<commit_message>
docs(legal): apply Juanes's trims to the law-firm pack; privacy covers the inbox
Juanes trimmed the pack for the firm: no dates, change logs, documents
table or "O que pedimos", one controller-qualification question dropped
from the note. His edits were made on the 27/09 copy, so they are applied
to the current sources rather than copied over — the accountant email and
Annex A stay removed. Privacy policy (live page + pack) now describes the
worker notifications inbox: what it stores, 180 days, erased with the
account. The pack no longer prints the "última atualização" line; the
live page keeps it.

Co-Authored-By: Claude Opus 5.5 <noreply@anthropic.com>
</commit_message>
<xml_diff>
--- a/docs/legal/pack-advogados/01 - Termos de Utilização - Trabalhadores.docx
+++ b/docs/legal/pack-advogados/01 - Termos de Utilização - Trabalhadores.docx
@@ -26,40 +26,7 @@
         <w:t xml:space="preserve">PRIMEIRA VERSÃO PARA REVISÃO JURÍDICA — NÃO PUBLICAR.</w:t>
       </w:r>
       <w:r>
-        <w:t xml:space="preserve"> Versão 0.1 · 2026-09-27. Escrita a partir do funcionamento real da aplicação, não de um modelo. As notas </w:t>
-      </w:r>
-      <w:r>
-        <w:rPr>
-          <w:rFonts w:ascii="Consolas" w:cs="Consolas" w:eastAsia="Consolas" w:hAnsi="Consolas"/>
-          <w:sz w:val="19"/>
-          <w:szCs w:val="19"/>
-        </w:rPr>
-        <w:t xml:space="preserve">⚖️</w:t>
-      </w:r>
-      <w:r>
-        <w:t xml:space="preserve"> são perguntas para o advogado e saem do texto final. Os campos </w:t>
-      </w:r>
-      <w:r>
-        <w:rPr>
-          <w:rFonts w:ascii="Consolas" w:cs="Consolas" w:eastAsia="Consolas" w:hAnsi="Consolas"/>
-          <w:sz w:val="19"/>
-          <w:szCs w:val="19"/>
-        </w:rPr>
-        <w:t xml:space="preserve">[[…]]</w:t>
-      </w:r>
-      <w:r>
-        <w:t xml:space="preserve"> são dados da sociedade ainda por preencher. Documentos relacionados: Política de Privacidade (</w:t>
-      </w:r>
-      <w:r>
-        <w:rPr>
-          <w:rFonts w:ascii="Consolas" w:cs="Consolas" w:eastAsia="Consolas" w:hAnsi="Consolas"/>
-          <w:sz w:val="19"/>
-          <w:szCs w:val="19"/>
-        </w:rPr>
-        <w:t xml:space="preserve">/privacidade</w:t>
-      </w:r>
-      <w:r>
-        <w:t xml:space="preserve">), Política de Cancelamento e Faltas v1.2, Termos para Empresas.</w:t>
+        <w:t xml:space="preserve"> Versão 0.1 · 2026-09-27. Escrita a partir do funcionamento real da aplicação, não de um modelo.</w:t>
       </w:r>
     </w:p>
     <w:p>

</xml_diff>